<commit_message>
docs: add uv venv setup instructions to README, SDK, and webui README
</commit_message>
<xml_diff>
--- a/python/SDK.docx
+++ b/python/SDK.docx
@@ -2,7 +2,7 @@
 <file path=word/document.xml><?xml version="1.0" encoding="utf-8"?>
 <w:document xmlns:w="http://schemas.openxmlformats.org/wordprocessingml/2006/main" xmlns:m="http://schemas.openxmlformats.org/officeDocument/2006/math" xmlns:r="http://schemas.openxmlformats.org/officeDocument/2006/relationships" xmlns:o="urn:schemas-microsoft-com:office:office" xmlns:v="urn:schemas-microsoft-com:vml" xmlns:w10="urn:schemas-microsoft-com:office:word" xmlns:a="http://schemas.openxmlformats.org/drawingml/2006/main" xmlns:pic="http://schemas.openxmlformats.org/drawingml/2006/picture" xmlns:wp="http://schemas.openxmlformats.org/drawingml/2006/wordprocessingDrawing">
   <w:body>
-    <w:bookmarkStart w:id="132" w:name="ai-graphdb-engine-sdk-documentation"/>
+    <w:bookmarkStart w:id="137" w:name="ai-graphdb-engine-sdk-documentation"/>
     <w:p>
       <w:pPr>
         <w:pStyle w:val="Heading1"/>
@@ -1018,7 +1018,7 @@
     </w:p>
     <w:bookmarkEnd w:id="22"/>
     <w:bookmarkEnd w:id="23"/>
-    <w:bookmarkStart w:id="28" w:name="installation"/>
+    <w:bookmarkStart w:id="33" w:name="installation"/>
     <w:p>
       <w:pPr>
         <w:pStyle w:val="Heading2"/>
@@ -1027,7 +1027,7 @@
         <w:t xml:space="preserve">Installation</w:t>
       </w:r>
     </w:p>
-    <w:bookmarkStart w:id="25" w:name="prerequisites"/>
+    <w:bookmarkStart w:id="26" w:name="prerequisites"/>
     <w:p>
       <w:pPr>
         <w:pStyle w:val="Heading3"/>
@@ -1045,7 +1045,7 @@
         <w:pStyle w:val="Compact"/>
       </w:pPr>
       <w:r>
-        <w:t xml:space="preserve">Python 3.8+</w:t>
+        <w:t xml:space="preserve">Python 3.10+</w:t>
       </w:r>
     </w:p>
     <w:p>
@@ -1056,13 +1056,36 @@
         </w:numPr>
         <w:pStyle w:val="Compact"/>
       </w:pPr>
+      <w:hyperlink r:id="rId24">
+        <w:r>
+          <w:rPr>
+            <w:rStyle w:val="VerbatimChar"/>
+          </w:rPr>
+          <w:t xml:space="preserve">uv</w:t>
+        </w:r>
+      </w:hyperlink>
+      <w:r>
+        <w:t xml:space="preserve"> </w:t>
+      </w:r>
+      <w:r>
+        <w:t xml:space="preserve">— recommended (fast, reproducible venvs)</w:t>
+      </w:r>
+    </w:p>
+    <w:p>
+      <w:pPr>
+        <w:numPr>
+          <w:ilvl w:val="0"/>
+          <w:numId w:val="1006"/>
+        </w:numPr>
+        <w:pStyle w:val="Compact"/>
+      </w:pPr>
       <w:r>
         <w:t xml:space="preserve">Optional:</w:t>
       </w:r>
       <w:r>
         <w:t xml:space="preserve"> </w:t>
       </w:r>
-      <w:hyperlink r:id="rId24">
+      <w:hyperlink r:id="rId25">
         <w:r>
           <w:rPr>
             <w:rStyle w:val="Hyperlink"/>
@@ -1074,17 +1097,81 @@
         <w:t xml:space="preserve"> </w:t>
       </w:r>
       <w:r>
-        <w:t xml:space="preserve">for local models</w:t>
-      </w:r>
-    </w:p>
-    <w:bookmarkEnd w:id="25"/>
-    <w:bookmarkStart w:id="26" w:name="install"/>
+        <w:t xml:space="preserve">for local embedding / LLM models</w:t>
+      </w:r>
+    </w:p>
+    <w:bookmarkEnd w:id="26"/>
+    <w:bookmarkStart w:id="27" w:name="recommended-uv-venv"/>
     <w:p>
       <w:pPr>
         <w:pStyle w:val="Heading3"/>
       </w:pPr>
       <w:r>
-        <w:t xml:space="preserve">Install</w:t>
+        <w:t xml:space="preserve">Recommended —</w:t>
+      </w:r>
+      <w:r>
+        <w:t xml:space="preserve"> </w:t>
+      </w:r>
+      <w:r>
+        <w:rPr>
+          <w:rStyle w:val="VerbatimChar"/>
+        </w:rPr>
+        <w:t xml:space="preserve">uv</w:t>
+      </w:r>
+      <w:r>
+        <w:t xml:space="preserve"> </w:t>
+      </w:r>
+      <w:r>
+        <w:t xml:space="preserve">venv</w:t>
+      </w:r>
+    </w:p>
+    <w:p>
+      <w:pPr>
+        <w:pStyle w:val="FirstParagraph"/>
+      </w:pPr>
+      <w:hyperlink r:id="rId24">
+        <w:r>
+          <w:rPr>
+            <w:rStyle w:val="VerbatimChar"/>
+          </w:rPr>
+          <w:t xml:space="preserve">uv</w:t>
+        </w:r>
+      </w:hyperlink>
+      <w:r>
+        <w:t xml:space="preserve"> </w:t>
+      </w:r>
+      <w:r>
+        <w:t xml:space="preserve">is a drop-in replacement for</w:t>
+      </w:r>
+      <w:r>
+        <w:t xml:space="preserve"> </w:t>
+      </w:r>
+      <w:r>
+        <w:rPr>
+          <w:rStyle w:val="VerbatimChar"/>
+        </w:rPr>
+        <w:t xml:space="preserve">pip</w:t>
+      </w:r>
+      <w:r>
+        <w:t xml:space="preserve"> </w:t>
+      </w:r>
+      <w:r>
+        <w:t xml:space="preserve">/</w:t>
+      </w:r>
+      <w:r>
+        <w:t xml:space="preserve"> </w:t>
+      </w:r>
+      <w:r>
+        <w:rPr>
+          <w:rStyle w:val="VerbatimChar"/>
+        </w:rPr>
+        <w:t xml:space="preserve">venv</w:t>
+      </w:r>
+      <w:r>
+        <w:t xml:space="preserve"> </w:t>
+      </w:r>
+      <w:r>
+        <w:t xml:space="preserve">that is 10–100× faster and produces fully reproducible environments.</w:t>
       </w:r>
     </w:p>
     <w:p>
@@ -1095,15 +1182,81 @@
         <w:rPr>
           <w:rStyle w:val="CommentTok"/>
         </w:rPr>
-        <w:t xml:space="preserve"># Clone the repository</w:t>
-      </w:r>
-      <w:r>
-        <w:br/>
+        <w:t xml:space="preserve"># 1. Install uv (once, system-wide)</w:t>
+      </w:r>
+      <w:r>
+        <w:br/>
+      </w:r>
+      <w:r>
+        <w:rPr>
+          <w:rStyle w:val="ExtensionTok"/>
+        </w:rPr>
+        <w:t xml:space="preserve">curl</w:t>
+      </w:r>
+      <w:r>
+        <w:rPr>
+          <w:rStyle w:val="NormalTok"/>
+        </w:rPr>
+        <w:t xml:space="preserve"> </w:t>
+      </w:r>
+      <w:r>
+        <w:rPr>
+          <w:rStyle w:val="AttributeTok"/>
+        </w:rPr>
+        <w:t xml:space="preserve">-LsSf</w:t>
+      </w:r>
+      <w:r>
+        <w:rPr>
+          <w:rStyle w:val="NormalTok"/>
+        </w:rPr>
+        <w:t xml:space="preserve"> https://astral.sh/uv/install.sh </w:t>
+      </w:r>
+      <w:r>
+        <w:rPr>
+          <w:rStyle w:val="KeywordTok"/>
+        </w:rPr>
+        <w:t xml:space="preserve">|</w:t>
+      </w:r>
+      <w:r>
+        <w:rPr>
+          <w:rStyle w:val="NormalTok"/>
+        </w:rPr>
+        <w:t xml:space="preserve"> </w:t>
       </w:r>
       <w:r>
         <w:rPr>
           <w:rStyle w:val="FunctionTok"/>
         </w:rPr>
+        <w:t xml:space="preserve">sh</w:t>
+      </w:r>
+      <w:r>
+        <w:br/>
+      </w:r>
+      <w:r>
+        <w:rPr>
+          <w:rStyle w:val="CommentTok"/>
+        </w:rPr>
+        <w:t xml:space="preserve"># or:  pip install uv</w:t>
+      </w:r>
+      <w:r>
+        <w:br/>
+      </w:r>
+      <w:r>
+        <w:br/>
+      </w:r>
+      <w:r>
+        <w:rPr>
+          <w:rStyle w:val="CommentTok"/>
+        </w:rPr>
+        <w:t xml:space="preserve"># 2. Clone the repository</w:t>
+      </w:r>
+      <w:r>
+        <w:br/>
+      </w:r>
+      <w:r>
+        <w:rPr>
+          <w:rStyle w:val="FunctionTok"/>
+        </w:rPr>
         <w:t xml:space="preserve">git</w:t>
       </w:r>
       <w:r>
@@ -1137,7 +1290,7 @@
         <w:rPr>
           <w:rStyle w:val="CommentTok"/>
         </w:rPr>
-        <w:t xml:space="preserve"># Install in editable mode</w:t>
+        <w:t xml:space="preserve"># 3. Create an isolated virtual environment</w:t>
       </w:r>
       <w:r>
         <w:br/>
@@ -1146,8 +1299,560 @@
         <w:rPr>
           <w:rStyle w:val="ExtensionTok"/>
         </w:rPr>
+        <w:t xml:space="preserve">uv</w:t>
+      </w:r>
+      <w:r>
+        <w:rPr>
+          <w:rStyle w:val="NormalTok"/>
+        </w:rPr>
+        <w:t xml:space="preserve"> venv .venv</w:t>
+      </w:r>
+      <w:r>
+        <w:br/>
+      </w:r>
+      <w:r>
+        <w:br/>
+      </w:r>
+      <w:r>
+        <w:rPr>
+          <w:rStyle w:val="CommentTok"/>
+        </w:rPr>
+        <w:t xml:space="preserve"># 4. Activate the environment</w:t>
+      </w:r>
+      <w:r>
+        <w:br/>
+      </w:r>
+      <w:r>
+        <w:rPr>
+          <w:rStyle w:val="BuiltInTok"/>
+        </w:rPr>
+        <w:t xml:space="preserve">source</w:t>
+      </w:r>
+      <w:r>
+        <w:rPr>
+          <w:rStyle w:val="NormalTok"/>
+        </w:rPr>
+        <w:t xml:space="preserve"> .venv/bin/activate         </w:t>
+      </w:r>
+      <w:r>
+        <w:rPr>
+          <w:rStyle w:val="CommentTok"/>
+        </w:rPr>
+        <w:t xml:space="preserve"># Linux / macOS</w:t>
+      </w:r>
+      <w:r>
+        <w:br/>
+      </w:r>
+      <w:r>
+        <w:rPr>
+          <w:rStyle w:val="CommentTok"/>
+        </w:rPr>
+        <w:t xml:space="preserve"># .venv\Scripts\activate          # Windows PowerShell</w:t>
+      </w:r>
+      <w:r>
+        <w:br/>
+      </w:r>
+      <w:r>
+        <w:br/>
+      </w:r>
+      <w:r>
+        <w:rPr>
+          <w:rStyle w:val="CommentTok"/>
+        </w:rPr>
+        <w:t xml:space="preserve"># 5. Install dependencies</w:t>
+      </w:r>
+      <w:r>
+        <w:br/>
+      </w:r>
+      <w:r>
+        <w:rPr>
+          <w:rStyle w:val="ExtensionTok"/>
+        </w:rPr>
+        <w:t xml:space="preserve">uv</w:t>
+      </w:r>
+      <w:r>
+        <w:rPr>
+          <w:rStyle w:val="NormalTok"/>
+        </w:rPr>
+        <w:t xml:space="preserve"> pip install </w:t>
+      </w:r>
+      <w:r>
+        <w:rPr>
+          <w:rStyle w:val="AttributeTok"/>
+        </w:rPr>
+        <w:t xml:space="preserve">-e</w:t>
+      </w:r>
+      <w:r>
+        <w:rPr>
+          <w:rStyle w:val="NormalTok"/>
+        </w:rPr>
+        <w:t xml:space="preserve"> .               </w:t>
+      </w:r>
+      <w:r>
+        <w:rPr>
+          <w:rStyle w:val="CommentTok"/>
+        </w:rPr>
+        <w:t xml:space="preserve"># core engine — pure Python</w:t>
+      </w:r>
+      <w:r>
+        <w:br/>
+      </w:r>
+      <w:r>
+        <w:rPr>
+          <w:rStyle w:val="ExtensionTok"/>
+        </w:rPr>
+        <w:t xml:space="preserve">uv</w:t>
+      </w:r>
+      <w:r>
+        <w:rPr>
+          <w:rStyle w:val="NormalTok"/>
+        </w:rPr>
+        <w:t xml:space="preserve"> pip install </w:t>
+      </w:r>
+      <w:r>
+        <w:rPr>
+          <w:rStyle w:val="AttributeTok"/>
+        </w:rPr>
+        <w:t xml:space="preserve">-r</w:t>
+      </w:r>
+      <w:r>
+        <w:rPr>
+          <w:rStyle w:val="NormalTok"/>
+        </w:rPr>
+        <w:t xml:space="preserve"> requirements.txt    </w:t>
+      </w:r>
+      <w:r>
+        <w:rPr>
+          <w:rStyle w:val="CommentTok"/>
+        </w:rPr>
+        <w:t xml:space="preserve"># fastapi, uvicorn, pydantic, numpy, pytest</w:t>
+      </w:r>
+    </w:p>
+    <w:p>
+      <w:pPr>
+        <w:pStyle w:val="BlockText"/>
+      </w:pPr>
+      <w:r>
+        <w:rPr>
+          <w:bCs/>
+          <w:b/>
+        </w:rPr>
+        <w:t xml:space="preserve">Optional extras</w:t>
+      </w:r>
+    </w:p>
+    <w:p>
+      <w:pPr>
+        <w:pStyle w:val="SourceCode"/>
+      </w:pPr>
+      <w:r>
+        <w:rPr>
+          <w:rStyle w:val="ExtensionTok"/>
+        </w:rPr>
+        <w:t xml:space="preserve">uv</w:t>
+      </w:r>
+      <w:r>
+        <w:rPr>
+          <w:rStyle w:val="NormalTok"/>
+        </w:rPr>
+        <w:t xml:space="preserve"> pip install </w:t>
+      </w:r>
+      <w:r>
+        <w:rPr>
+          <w:rStyle w:val="AttributeTok"/>
+        </w:rPr>
+        <w:t xml:space="preserve">-e</w:t>
+      </w:r>
+      <w:r>
+        <w:rPr>
+          <w:rStyle w:val="NormalTok"/>
+        </w:rPr>
+        <w:t xml:space="preserve"> </w:t>
+      </w:r>
+      <w:r>
+        <w:rPr>
+          <w:rStyle w:val="StringTok"/>
+        </w:rPr>
+        <w:t xml:space="preserve">".[fast]"</w:t>
+      </w:r>
+      <w:r>
+        <w:rPr>
+          <w:rStyle w:val="NormalTok"/>
+        </w:rPr>
+        <w:t xml:space="preserve">     </w:t>
+      </w:r>
+      <w:r>
+        <w:rPr>
+          <w:rStyle w:val="CommentTok"/>
+        </w:rPr>
+        <w:t xml:space="preserve"># numpy acceleration for vector ops</w:t>
+      </w:r>
+      <w:r>
+        <w:br/>
+      </w:r>
+      <w:r>
+        <w:rPr>
+          <w:rStyle w:val="ExtensionTok"/>
+        </w:rPr>
+        <w:t xml:space="preserve">uv</w:t>
+      </w:r>
+      <w:r>
+        <w:rPr>
+          <w:rStyle w:val="NormalTok"/>
+        </w:rPr>
+        <w:t xml:space="preserve"> pip install </w:t>
+      </w:r>
+      <w:r>
+        <w:rPr>
+          <w:rStyle w:val="AttributeTok"/>
+        </w:rPr>
+        <w:t xml:space="preserve">-e</w:t>
+      </w:r>
+      <w:r>
+        <w:rPr>
+          <w:rStyle w:val="NormalTok"/>
+        </w:rPr>
+        <w:t xml:space="preserve"> </w:t>
+      </w:r>
+      <w:r>
+        <w:rPr>
+          <w:rStyle w:val="StringTok"/>
+        </w:rPr>
+        <w:t xml:space="preserve">".[test]"</w:t>
+      </w:r>
+      <w:r>
+        <w:rPr>
+          <w:rStyle w:val="NormalTok"/>
+        </w:rPr>
+        <w:t xml:space="preserve">     </w:t>
+      </w:r>
+      <w:r>
+        <w:rPr>
+          <w:rStyle w:val="CommentTok"/>
+        </w:rPr>
+        <w:t xml:space="preserve"># pytest test suite</w:t>
+      </w:r>
+    </w:p>
+    <w:p>
+      <w:pPr>
+        <w:pStyle w:val="BlockText"/>
+      </w:pPr>
+      <w:r>
+        <w:rPr>
+          <w:bCs/>
+          <w:b/>
+        </w:rPr>
+        <w:t xml:space="preserve">Optional document-loader backends</w:t>
+      </w:r>
+      <w:r>
+        <w:t xml:space="preserve"> </w:t>
+      </w:r>
+      <w:r>
+        <w:t xml:space="preserve">(install only what you need):</w:t>
+      </w:r>
+    </w:p>
+    <w:p>
+      <w:pPr>
+        <w:pStyle w:val="SourceCode"/>
+      </w:pPr>
+      <w:r>
+        <w:rPr>
+          <w:rStyle w:val="ExtensionTok"/>
+        </w:rPr>
+        <w:t xml:space="preserve">uv</w:t>
+      </w:r>
+      <w:r>
+        <w:rPr>
+          <w:rStyle w:val="NormalTok"/>
+        </w:rPr>
+        <w:t xml:space="preserve"> pip install pypdf             </w:t>
+      </w:r>
+      <w:r>
+        <w:rPr>
+          <w:rStyle w:val="CommentTok"/>
+        </w:rPr>
+        <w:t xml:space="preserve"># PDF support</w:t>
+      </w:r>
+      <w:r>
+        <w:br/>
+      </w:r>
+      <w:r>
+        <w:rPr>
+          <w:rStyle w:val="ExtensionTok"/>
+        </w:rPr>
+        <w:t xml:space="preserve">uv</w:t>
+      </w:r>
+      <w:r>
+        <w:rPr>
+          <w:rStyle w:val="NormalTok"/>
+        </w:rPr>
+        <w:t xml:space="preserve"> pip install python-docx       </w:t>
+      </w:r>
+      <w:r>
+        <w:rPr>
+          <w:rStyle w:val="CommentTok"/>
+        </w:rPr>
+        <w:t xml:space="preserve"># Word / DOCX support</w:t>
+      </w:r>
+      <w:r>
+        <w:br/>
+      </w:r>
+      <w:r>
+        <w:rPr>
+          <w:rStyle w:val="ExtensionTok"/>
+        </w:rPr>
+        <w:t xml:space="preserve">uv</w:t>
+      </w:r>
+      <w:r>
+        <w:rPr>
+          <w:rStyle w:val="NormalTok"/>
+        </w:rPr>
+        <w:t xml:space="preserve"> pip install pandas openpyxl   </w:t>
+      </w:r>
+      <w:r>
+        <w:rPr>
+          <w:rStyle w:val="CommentTok"/>
+        </w:rPr>
+        <w:t xml:space="preserve"># CSV, Excel (.xlsx)</w:t>
+      </w:r>
+      <w:r>
+        <w:br/>
+      </w:r>
+      <w:r>
+        <w:rPr>
+          <w:rStyle w:val="ExtensionTok"/>
+        </w:rPr>
+        <w:t xml:space="preserve">uv</w:t>
+      </w:r>
+      <w:r>
+        <w:rPr>
+          <w:rStyle w:val="NormalTok"/>
+        </w:rPr>
+        <w:t xml:space="preserve"> pip install pandas pyarrow    </w:t>
+      </w:r>
+      <w:r>
+        <w:rPr>
+          <w:rStyle w:val="CommentTok"/>
+        </w:rPr>
+        <w:t xml:space="preserve"># Parquet export</w:t>
+      </w:r>
+    </w:p>
+    <w:p>
+      <w:pPr>
+        <w:pStyle w:val="BlockText"/>
+      </w:pPr>
+      <w:r>
+        <w:rPr>
+          <w:bCs/>
+          <w:b/>
+        </w:rPr>
+        <w:t xml:space="preserve">Needle2 embedded agent</w:t>
+      </w:r>
+      <w:r>
+        <w:t xml:space="preserve"> </w:t>
+      </w:r>
+      <w:r>
+        <w:t xml:space="preserve">(optional fine-tuning pipeline):</w:t>
+      </w:r>
+    </w:p>
+    <w:p>
+      <w:pPr>
+        <w:pStyle w:val="SourceCode"/>
+      </w:pPr>
+      <w:r>
+        <w:rPr>
+          <w:rStyle w:val="ExtensionTok"/>
+        </w:rPr>
+        <w:t xml:space="preserve">uv</w:t>
+      </w:r>
+      <w:r>
+        <w:rPr>
+          <w:rStyle w:val="NormalTok"/>
+        </w:rPr>
+        <w:t xml:space="preserve"> pip install cactus-needle                   </w:t>
+      </w:r>
+      <w:r>
+        <w:rPr>
+          <w:rStyle w:val="CommentTok"/>
+        </w:rPr>
+        <w:t xml:space="preserve"># inference only</w:t>
+      </w:r>
+      <w:r>
+        <w:br/>
+      </w:r>
+      <w:r>
+        <w:rPr>
+          <w:rStyle w:val="ExtensionTok"/>
+        </w:rPr>
+        <w:t xml:space="preserve">uv</w:t>
+      </w:r>
+      <w:r>
+        <w:rPr>
+          <w:rStyle w:val="NormalTok"/>
+        </w:rPr>
+        <w:t xml:space="preserve"> pip install </w:t>
+      </w:r>
+      <w:r>
+        <w:rPr>
+          <w:rStyle w:val="StringTok"/>
+        </w:rPr>
+        <w:t xml:space="preserve">'cactus-needle[train]'</w:t>
+      </w:r>
+      <w:r>
+        <w:rPr>
+          <w:rStyle w:val="NormalTok"/>
+        </w:rPr>
+        <w:t xml:space="preserve">          </w:t>
+      </w:r>
+      <w:r>
+        <w:rPr>
+          <w:rStyle w:val="CommentTok"/>
+        </w:rPr>
+        <w:t xml:space="preserve"># + fine-tuning (CPU / JAX)</w:t>
+      </w:r>
+      <w:r>
+        <w:br/>
+      </w:r>
+      <w:r>
+        <w:rPr>
+          <w:rStyle w:val="ExtensionTok"/>
+        </w:rPr>
+        <w:t xml:space="preserve">uv</w:t>
+      </w:r>
+      <w:r>
+        <w:rPr>
+          <w:rStyle w:val="NormalTok"/>
+        </w:rPr>
+        <w:t xml:space="preserve"> pip install </w:t>
+      </w:r>
+      <w:r>
+        <w:rPr>
+          <w:rStyle w:val="StringTok"/>
+        </w:rPr>
+        <w:t xml:space="preserve">'cactus-needle[train,gpu]'</w:t>
+      </w:r>
+      <w:r>
+        <w:rPr>
+          <w:rStyle w:val="NormalTok"/>
+        </w:rPr>
+        <w:t xml:space="preserve">      </w:t>
+      </w:r>
+      <w:r>
+        <w:rPr>
+          <w:rStyle w:val="CommentTok"/>
+        </w:rPr>
+        <w:t xml:space="preserve"># NVIDIA GPU training</w:t>
+      </w:r>
+      <w:r>
+        <w:br/>
+      </w:r>
+      <w:r>
+        <w:rPr>
+          <w:rStyle w:val="ExtensionTok"/>
+        </w:rPr>
+        <w:t xml:space="preserve">uv</w:t>
+      </w:r>
+      <w:r>
+        <w:rPr>
+          <w:rStyle w:val="NormalTok"/>
+        </w:rPr>
+        <w:t xml:space="preserve"> pip install </w:t>
+      </w:r>
+      <w:r>
+        <w:rPr>
+          <w:rStyle w:val="StringTok"/>
+        </w:rPr>
+        <w:t xml:space="preserve">'cactus-needle[train,metal]'</w:t>
+      </w:r>
+      <w:r>
+        <w:rPr>
+          <w:rStyle w:val="NormalTok"/>
+        </w:rPr>
+        <w:t xml:space="preserve">    </w:t>
+      </w:r>
+      <w:r>
+        <w:rPr>
+          <w:rStyle w:val="CommentTok"/>
+        </w:rPr>
+        <w:t xml:space="preserve"># Apple Silicon</w:t>
+      </w:r>
+    </w:p>
+    <w:bookmarkEnd w:id="27"/>
+    <w:bookmarkStart w:id="28" w:name="alternative-plain-pip"/>
+    <w:p>
+      <w:pPr>
+        <w:pStyle w:val="Heading3"/>
+      </w:pPr>
+      <w:r>
+        <w:t xml:space="preserve">Alternative — plain</w:t>
+      </w:r>
+      <w:r>
+        <w:t xml:space="preserve"> </w:t>
+      </w:r>
+      <w:r>
+        <w:rPr>
+          <w:rStyle w:val="VerbatimChar"/>
+        </w:rPr>
         <w:t xml:space="preserve">pip</w:t>
       </w:r>
+    </w:p>
+    <w:p>
+      <w:pPr>
+        <w:pStyle w:val="SourceCode"/>
+      </w:pPr>
+      <w:r>
+        <w:rPr>
+          <w:rStyle w:val="ExtensionTok"/>
+        </w:rPr>
+        <w:t xml:space="preserve">python</w:t>
+      </w:r>
+      <w:r>
+        <w:rPr>
+          <w:rStyle w:val="NormalTok"/>
+        </w:rPr>
+        <w:t xml:space="preserve"> </w:t>
+      </w:r>
+      <w:r>
+        <w:rPr>
+          <w:rStyle w:val="AttributeTok"/>
+        </w:rPr>
+        <w:t xml:space="preserve">-m</w:t>
+      </w:r>
+      <w:r>
+        <w:rPr>
+          <w:rStyle w:val="NormalTok"/>
+        </w:rPr>
+        <w:t xml:space="preserve"> venv .venv</w:t>
+      </w:r>
+      <w:r>
+        <w:br/>
+      </w:r>
+      <w:r>
+        <w:rPr>
+          <w:rStyle w:val="BuiltInTok"/>
+        </w:rPr>
+        <w:t xml:space="preserve">source</w:t>
+      </w:r>
+      <w:r>
+        <w:rPr>
+          <w:rStyle w:val="NormalTok"/>
+        </w:rPr>
+        <w:t xml:space="preserve"> .venv/bin/activate         </w:t>
+      </w:r>
+      <w:r>
+        <w:rPr>
+          <w:rStyle w:val="CommentTok"/>
+        </w:rPr>
+        <w:t xml:space="preserve"># Linux / macOS</w:t>
+      </w:r>
+      <w:r>
+        <w:br/>
+      </w:r>
+      <w:r>
+        <w:rPr>
+          <w:rStyle w:val="ExtensionTok"/>
+        </w:rPr>
+        <w:t xml:space="preserve">pip</w:t>
+      </w:r>
       <w:r>
         <w:rPr>
           <w:rStyle w:val="NormalTok"/>
@@ -1170,59 +1875,214 @@
         <w:br/>
       </w:r>
       <w:r>
-        <w:br/>
+        <w:rPr>
+          <w:rStyle w:val="ExtensionTok"/>
+        </w:rPr>
+        <w:t xml:space="preserve">pip</w:t>
+      </w:r>
+      <w:r>
+        <w:rPr>
+          <w:rStyle w:val="NormalTok"/>
+        </w:rPr>
+        <w:t xml:space="preserve"> install </w:t>
+      </w:r>
+      <w:r>
+        <w:rPr>
+          <w:rStyle w:val="AttributeTok"/>
+        </w:rPr>
+        <w:t xml:space="preserve">-r</w:t>
+      </w:r>
+      <w:r>
+        <w:rPr>
+          <w:rStyle w:val="NormalTok"/>
+        </w:rPr>
+        <w:t xml:space="preserve"> requirements.txt</w:t>
+      </w:r>
+    </w:p>
+    <w:bookmarkEnd w:id="28"/>
+    <w:bookmarkStart w:id="30" w:name="run-the-web-ui"/>
+    <w:p>
+      <w:pPr>
+        <w:pStyle w:val="Heading3"/>
+      </w:pPr>
+      <w:r>
+        <w:t xml:space="preserve">Run the web UI</w:t>
+      </w:r>
+    </w:p>
+    <w:p>
+      <w:pPr>
+        <w:pStyle w:val="SourceCode"/>
+      </w:pPr>
+      <w:r>
+        <w:rPr>
+          <w:rStyle w:val="ExtensionTok"/>
+        </w:rPr>
+        <w:t xml:space="preserve">python</w:t>
+      </w:r>
+      <w:r>
+        <w:rPr>
+          <w:rStyle w:val="NormalTok"/>
+        </w:rPr>
+        <w:t xml:space="preserve"> </w:t>
+      </w:r>
+      <w:r>
+        <w:rPr>
+          <w:rStyle w:val="AttributeTok"/>
+        </w:rPr>
+        <w:t xml:space="preserve">-m</w:t>
+      </w:r>
+      <w:r>
+        <w:rPr>
+          <w:rStyle w:val="NormalTok"/>
+        </w:rPr>
+        <w:t xml:space="preserve"> webui.run               </w:t>
       </w:r>
       <w:r>
         <w:rPr>
           <w:rStyle w:val="CommentTok"/>
         </w:rPr>
-        <w:t xml:space="preserve"># Optional: install the faster Rust backend</w:t>
-      </w:r>
-      <w:r>
-        <w:br/>
-      </w:r>
-      <w:r>
-        <w:rPr>
-          <w:rStyle w:val="BuiltInTok"/>
-        </w:rPr>
-        <w:t xml:space="preserve">cd</w:t>
-      </w:r>
-      <w:r>
-        <w:rPr>
-          <w:rStyle w:val="NormalTok"/>
-        </w:rPr>
-        <w:t xml:space="preserve"> ../rust</w:t>
-      </w:r>
-      <w:r>
-        <w:br/>
-      </w:r>
+        <w:t xml:space="preserve"># → http://localhost:3000</w:t>
+      </w:r>
+    </w:p>
+    <w:p>
+      <w:pPr>
+        <w:pStyle w:val="FirstParagraph"/>
+      </w:pPr>
+      <w:r>
+        <w:t xml:space="preserve">Open</w:t>
+      </w:r>
+      <w:r>
+        <w:t xml:space="preserve"> </w:t>
+      </w:r>
+      <w:hyperlink r:id="rId29">
+        <w:r>
+          <w:rPr>
+            <w:rStyle w:val="Hyperlink"/>
+          </w:rPr>
+          <w:t xml:space="preserve">http://localhost:3000</w:t>
+        </w:r>
+      </w:hyperlink>
+      <w:r>
+        <w:t xml:space="preserve"> </w:t>
+      </w:r>
+      <w:r>
+        <w:t xml:space="preserve">and click</w:t>
+      </w:r>
+      <w:r>
+        <w:t xml:space="preserve"> </w:t>
+      </w:r>
+      <w:r>
+        <w:rPr>
+          <w:bCs/>
+          <w:b/>
+        </w:rPr>
+        <w:t xml:space="preserve">Seed demo</w:t>
+      </w:r>
+      <w:r>
+        <w:t xml:space="preserve"> </w:t>
+      </w:r>
+      <w:r>
+        <w:t xml:space="preserve">to populate example data.</w:t>
+      </w:r>
+      <w:r>
+        <w:t xml:space="preserve"> </w:t>
+      </w:r>
+      <w:r>
+        <w:t xml:space="preserve">The graph is persisted to</w:t>
+      </w:r>
+      <w:r>
+        <w:t xml:space="preserve"> </w:t>
+      </w:r>
+      <w:r>
+        <w:rPr>
+          <w:rStyle w:val="VerbatimChar"/>
+        </w:rPr>
+        <w:t xml:space="preserve">webui_graph.json</w:t>
+      </w:r>
+      <w:r>
+        <w:t xml:space="preserve"> </w:t>
+      </w:r>
+      <w:r>
+        <w:t xml:space="preserve">(override via</w:t>
+      </w:r>
+      <w:r>
+        <w:t xml:space="preserve"> </w:t>
+      </w:r>
+      <w:r>
+        <w:rPr>
+          <w:rStyle w:val="VerbatimChar"/>
+        </w:rPr>
+        <w:t xml:space="preserve">GRAPHDB_WEB_PATH</w:t>
+      </w:r>
+      <w:r>
+        <w:t xml:space="preserve">).</w:t>
+      </w:r>
+    </w:p>
+    <w:bookmarkEnd w:id="30"/>
+    <w:bookmarkStart w:id="31" w:name="run-the-tests"/>
+    <w:p>
+      <w:pPr>
+        <w:pStyle w:val="Heading3"/>
+      </w:pPr>
+      <w:r>
+        <w:t xml:space="preserve">Run the tests</w:t>
+      </w:r>
+    </w:p>
+    <w:p>
+      <w:pPr>
+        <w:pStyle w:val="SourceCode"/>
+      </w:pPr>
       <w:r>
         <w:rPr>
           <w:rStyle w:val="ExtensionTok"/>
         </w:rPr>
-        <w:t xml:space="preserve">./build.sh</w:t>
-      </w:r>
-      <w:r>
-        <w:rPr>
-          <w:rStyle w:val="NormalTok"/>
-        </w:rPr>
-        <w:t xml:space="preserve">   </w:t>
+        <w:t xml:space="preserve">python</w:t>
+      </w:r>
+      <w:r>
+        <w:rPr>
+          <w:rStyle w:val="NormalTok"/>
+        </w:rPr>
+        <w:t xml:space="preserve"> </w:t>
+      </w:r>
+      <w:r>
+        <w:rPr>
+          <w:rStyle w:val="AttributeTok"/>
+        </w:rPr>
+        <w:t xml:space="preserve">-m</w:t>
+      </w:r>
+      <w:r>
+        <w:rPr>
+          <w:rStyle w:val="NormalTok"/>
+        </w:rPr>
+        <w:t xml:space="preserve"> pytest tests/ </w:t>
+      </w:r>
+      <w:r>
+        <w:rPr>
+          <w:rStyle w:val="AttributeTok"/>
+        </w:rPr>
+        <w:t xml:space="preserve">-v</w:t>
+      </w:r>
+      <w:r>
+        <w:rPr>
+          <w:rStyle w:val="NormalTok"/>
+        </w:rPr>
+        <w:t xml:space="preserve">        </w:t>
       </w:r>
       <w:r>
         <w:rPr>
           <w:rStyle w:val="CommentTok"/>
         </w:rPr>
-        <w:t xml:space="preserve"># requires Rust toolchain; falls back to Python if not built</w:t>
-      </w:r>
-    </w:p>
-    <w:bookmarkEnd w:id="26"/>
-    <w:bookmarkStart w:id="27" w:name="verify"/>
+        <w:t xml:space="preserve"># 156 tests, all should pass</w:t>
+      </w:r>
+    </w:p>
+    <w:bookmarkEnd w:id="31"/>
+    <w:bookmarkStart w:id="32" w:name="verify-the-install"/>
     <w:p>
       <w:pPr>
         <w:pStyle w:val="Heading3"/>
       </w:pPr>
       <w:r>
-        <w:t xml:space="preserve">Verify</w:t>
+        <w:t xml:space="preserve">Verify the install</w:t>
       </w:r>
     </w:p>
     <w:p>
@@ -1423,9 +2283,9 @@
         </w:pict>
       </w:r>
     </w:p>
-    <w:bookmarkEnd w:id="27"/>
-    <w:bookmarkEnd w:id="28"/>
-    <w:bookmarkStart w:id="34" w:name="core-concepts"/>
+    <w:bookmarkEnd w:id="32"/>
+    <w:bookmarkEnd w:id="33"/>
+    <w:bookmarkStart w:id="39" w:name="core-concepts"/>
     <w:p>
       <w:pPr>
         <w:pStyle w:val="Heading2"/>
@@ -1434,7 +2294,7 @@
         <w:t xml:space="preserve">Core Concepts</w:t>
       </w:r>
     </w:p>
-    <w:bookmarkStart w:id="29" w:name="nodes"/>
+    <w:bookmarkStart w:id="34" w:name="nodes"/>
     <w:p>
       <w:pPr>
         <w:pStyle w:val="Heading3"/>
@@ -1755,8 +2615,8 @@
         <w:t xml:space="preserve">— MCP/A2A protocol nodes</w:t>
       </w:r>
     </w:p>
-    <w:bookmarkEnd w:id="29"/>
-    <w:bookmarkStart w:id="30" w:name="edges"/>
+    <w:bookmarkEnd w:id="34"/>
+    <w:bookmarkStart w:id="35" w:name="edges"/>
     <w:p>
       <w:pPr>
         <w:pStyle w:val="Heading3"/>
@@ -2140,8 +3000,8 @@
         <w:t xml:space="preserve">— MCP/A2A protocol edges</w:t>
       </w:r>
     </w:p>
-    <w:bookmarkEnd w:id="30"/>
-    <w:bookmarkStart w:id="31" w:name="label-scoped-vector-search"/>
+    <w:bookmarkEnd w:id="35"/>
+    <w:bookmarkStart w:id="36" w:name="label-scoped-vector-search"/>
     <w:p>
       <w:pPr>
         <w:pStyle w:val="Heading3"/>
@@ -2227,8 +3087,8 @@
         <w:t xml:space="preserve">).</w:t>
       </w:r>
     </w:p>
-    <w:bookmarkEnd w:id="31"/>
-    <w:bookmarkStart w:id="32" w:name="memory-types"/>
+    <w:bookmarkEnd w:id="36"/>
+    <w:bookmarkStart w:id="37" w:name="memory-types"/>
     <w:p>
       <w:pPr>
         <w:pStyle w:val="Heading3"/>
@@ -2375,8 +3235,8 @@
         <w:t xml:space="preserve">— affective state</w:t>
       </w:r>
     </w:p>
-    <w:bookmarkEnd w:id="32"/>
-    <w:bookmarkStart w:id="33" w:name="persistence"/>
+    <w:bookmarkEnd w:id="37"/>
+    <w:bookmarkStart w:id="38" w:name="persistence"/>
     <w:p>
       <w:pPr>
         <w:pStyle w:val="Heading3"/>
@@ -2481,9 +3341,9 @@
         </w:pict>
       </w:r>
     </w:p>
-    <w:bookmarkEnd w:id="33"/>
-    <w:bookmarkEnd w:id="34"/>
-    <w:bookmarkStart w:id="36" w:name="quick-start"/>
+    <w:bookmarkEnd w:id="38"/>
+    <w:bookmarkEnd w:id="39"/>
+    <w:bookmarkStart w:id="41" w:name="quick-start"/>
     <w:p>
       <w:pPr>
         <w:pStyle w:val="Heading2"/>
@@ -2492,7 +3352,7 @@
         <w:t xml:space="preserve">Quick Start</w:t>
       </w:r>
     </w:p>
-    <w:bookmarkStart w:id="35" w:name="minimal-working-example"/>
+    <w:bookmarkStart w:id="40" w:name="minimal-working-example"/>
     <w:p>
       <w:pPr>
         <w:pStyle w:val="Heading3"/>
@@ -3094,9 +3954,9 @@
         </w:pict>
       </w:r>
     </w:p>
-    <w:bookmarkEnd w:id="35"/>
-    <w:bookmarkEnd w:id="36"/>
-    <w:bookmarkStart w:id="84" w:name="api-reference"/>
+    <w:bookmarkEnd w:id="40"/>
+    <w:bookmarkEnd w:id="41"/>
+    <w:bookmarkStart w:id="89" w:name="api-reference"/>
     <w:p>
       <w:pPr>
         <w:pStyle w:val="Heading2"/>
@@ -3105,7 +3965,7 @@
         <w:t xml:space="preserve">API Reference</w:t>
       </w:r>
     </w:p>
-    <w:bookmarkStart w:id="44" w:name="graphstore"/>
+    <w:bookmarkStart w:id="49" w:name="graphstore"/>
     <w:p>
       <w:pPr>
         <w:pStyle w:val="Heading3"/>
@@ -3143,7 +4003,7 @@
         <w:t xml:space="preserve">The core property graph engine. Manages nodes, edges, indexes, and persistence.</w:t>
       </w:r>
     </w:p>
-    <w:bookmarkStart w:id="37" w:name="constructor"/>
+    <w:bookmarkStart w:id="42" w:name="constructor"/>
     <w:p>
       <w:pPr>
         <w:pStyle w:val="Heading4"/>
@@ -3217,8 +4077,8 @@
         <w:t xml:space="preserve">: If provided, auto-loads from disk on construction.</w:t>
       </w:r>
     </w:p>
-    <w:bookmarkEnd w:id="37"/>
-    <w:bookmarkStart w:id="43" w:name="methods"/>
+    <w:bookmarkEnd w:id="42"/>
+    <w:bookmarkStart w:id="48" w:name="methods"/>
     <w:p>
       <w:pPr>
         <w:pStyle w:val="Heading4"/>
@@ -3227,7 +4087,7 @@
         <w:t xml:space="preserve">Methods</w:t>
       </w:r>
     </w:p>
-    <w:bookmarkStart w:id="38" w:name="node-operations"/>
+    <w:bookmarkStart w:id="43" w:name="node-operations"/>
     <w:p>
       <w:pPr>
         <w:pStyle w:val="Heading5"/>
@@ -3464,8 +4324,8 @@
         <w:t xml:space="preserve">Get all nodes in the graph.</w:t>
       </w:r>
     </w:p>
-    <w:bookmarkEnd w:id="38"/>
-    <w:bookmarkStart w:id="39" w:name="edge-operations"/>
+    <w:bookmarkEnd w:id="43"/>
+    <w:bookmarkStart w:id="44" w:name="edge-operations"/>
     <w:p>
       <w:pPr>
         <w:pStyle w:val="Heading5"/>
@@ -3826,8 +4686,8 @@
         <w:t xml:space="preserve">Get all edges in the graph.</w:t>
       </w:r>
     </w:p>
-    <w:bookmarkEnd w:id="39"/>
-    <w:bookmarkStart w:id="40" w:name="search"/>
+    <w:bookmarkEnd w:id="44"/>
+    <w:bookmarkStart w:id="45" w:name="search"/>
     <w:p>
       <w:pPr>
         <w:pStyle w:val="Heading5"/>
@@ -4047,8 +4907,8 @@
         <w:t xml:space="preserve">sorted by score descending.</w:t>
       </w:r>
     </w:p>
-    <w:bookmarkEnd w:id="40"/>
-    <w:bookmarkStart w:id="41" w:name="persistence-1"/>
+    <w:bookmarkEnd w:id="45"/>
+    <w:bookmarkStart w:id="46" w:name="persistence-1"/>
     <w:p>
       <w:pPr>
         <w:pStyle w:val="Heading5"/>
@@ -4203,8 +5063,8 @@
         <w:t xml:space="preserve">Load the graph from disk.</w:t>
       </w:r>
     </w:p>
-    <w:bookmarkEnd w:id="41"/>
-    <w:bookmarkStart w:id="42" w:name="stats"/>
+    <w:bookmarkEnd w:id="46"/>
+    <w:bookmarkStart w:id="47" w:name="stats"/>
     <w:p>
       <w:pPr>
         <w:pStyle w:val="Heading5"/>
@@ -4263,10 +5123,10 @@
         </w:pict>
       </w:r>
     </w:p>
-    <w:bookmarkEnd w:id="42"/>
-    <w:bookmarkEnd w:id="43"/>
-    <w:bookmarkEnd w:id="44"/>
-    <w:bookmarkStart w:id="52" w:name="agentmemory"/>
+    <w:bookmarkEnd w:id="47"/>
+    <w:bookmarkEnd w:id="48"/>
+    <w:bookmarkEnd w:id="49"/>
+    <w:bookmarkStart w:id="57" w:name="agentmemory"/>
     <w:p>
       <w:pPr>
         <w:pStyle w:val="Heading3"/>
@@ -4319,7 +5179,7 @@
         <w:t xml:space="preserve">and provides semantic operations.</w:t>
       </w:r>
     </w:p>
-    <w:bookmarkStart w:id="45" w:name="constructor-1"/>
+    <w:bookmarkStart w:id="50" w:name="constructor-1"/>
     <w:p>
       <w:pPr>
         <w:pStyle w:val="Heading4"/>
@@ -4498,8 +5358,8 @@
         <w:t xml:space="preserve">: Optional session scope</w:t>
       </w:r>
     </w:p>
-    <w:bookmarkEnd w:id="45"/>
-    <w:bookmarkStart w:id="51" w:name="methods-1"/>
+    <w:bookmarkEnd w:id="50"/>
+    <w:bookmarkStart w:id="56" w:name="methods-1"/>
     <w:p>
       <w:pPr>
         <w:pStyle w:val="Heading4"/>
@@ -4508,7 +5368,7 @@
         <w:t xml:space="preserve">Methods</w:t>
       </w:r>
     </w:p>
-    <w:bookmarkStart w:id="46" w:name="store-memories"/>
+    <w:bookmarkStart w:id="51" w:name="store-memories"/>
     <w:p>
       <w:pPr>
         <w:pStyle w:val="Heading5"/>
@@ -4847,8 +5707,8 @@
         <w:t xml:space="preserve"># affective state</w:t>
       </w:r>
     </w:p>
-    <w:bookmarkEnd w:id="46"/>
-    <w:bookmarkStart w:id="47" w:name="retrieve-memories"/>
+    <w:bookmarkEnd w:id="51"/>
+    <w:bookmarkStart w:id="52" w:name="retrieve-memories"/>
     <w:p>
       <w:pPr>
         <w:pStyle w:val="Heading5"/>
@@ -5186,8 +6046,8 @@
         <w:t xml:space="preserve">+ formats).</w:t>
       </w:r>
     </w:p>
-    <w:bookmarkEnd w:id="47"/>
-    <w:bookmarkStart w:id="48" w:name="reflection"/>
+    <w:bookmarkEnd w:id="52"/>
+    <w:bookmarkStart w:id="53" w:name="reflection"/>
     <w:p>
       <w:pPr>
         <w:pStyle w:val="Heading5"/>
@@ -5284,8 +6144,8 @@
         <w:t xml:space="preserve">memory. Works offline (no LLM needed).</w:t>
       </w:r>
     </w:p>
-    <w:bookmarkEnd w:id="48"/>
-    <w:bookmarkStart w:id="49" w:name="entities"/>
+    <w:bookmarkEnd w:id="53"/>
+    <w:bookmarkStart w:id="54" w:name="entities"/>
     <w:p>
       <w:pPr>
         <w:pStyle w:val="Heading5"/>
@@ -5470,8 +6330,8 @@
         <w:t xml:space="preserve">Get an entity by name.</w:t>
       </w:r>
     </w:p>
-    <w:bookmarkEnd w:id="49"/>
-    <w:bookmarkStart w:id="50" w:name="stats-1"/>
+    <w:bookmarkEnd w:id="54"/>
+    <w:bookmarkStart w:id="55" w:name="stats-1"/>
     <w:p>
       <w:pPr>
         <w:pStyle w:val="Heading5"/>
@@ -5530,10 +6390,10 @@
         </w:pict>
       </w:r>
     </w:p>
-    <w:bookmarkEnd w:id="50"/>
-    <w:bookmarkEnd w:id="51"/>
-    <w:bookmarkEnd w:id="52"/>
-    <w:bookmarkStart w:id="58" w:name="embedders"/>
+    <w:bookmarkEnd w:id="55"/>
+    <w:bookmarkEnd w:id="56"/>
+    <w:bookmarkEnd w:id="57"/>
+    <w:bookmarkStart w:id="63" w:name="embedders"/>
     <w:p>
       <w:pPr>
         <w:pStyle w:val="Heading3"/>
@@ -5571,7 +6431,7 @@
         <w:t xml:space="preserve">Text → vector transformations.</w:t>
       </w:r>
     </w:p>
-    <w:bookmarkStart w:id="53" w:name="localembedder-default"/>
+    <w:bookmarkStart w:id="58" w:name="localembedder-default"/>
     <w:p>
       <w:pPr>
         <w:pStyle w:val="Heading4"/>
@@ -5726,8 +6586,8 @@
         <w:t xml:space="preserve">Good for testing; weaker semantic understanding than neural models</w:t>
       </w:r>
     </w:p>
-    <w:bookmarkEnd w:id="53"/>
-    <w:bookmarkStart w:id="54" w:name="ollamaembedder"/>
+    <w:bookmarkEnd w:id="58"/>
+    <w:bookmarkStart w:id="59" w:name="ollamaembedder"/>
     <w:p>
       <w:pPr>
         <w:pStyle w:val="Heading4"/>
@@ -6014,8 +6874,8 @@
         <w:t xml:space="preserve">nomic-embed-text</w:t>
       </w:r>
     </w:p>
-    <w:bookmarkEnd w:id="54"/>
-    <w:bookmarkStart w:id="55" w:name="openaiembedder"/>
+    <w:bookmarkEnd w:id="59"/>
+    <w:bookmarkStart w:id="60" w:name="openaiembedder"/>
     <w:p>
       <w:pPr>
         <w:pStyle w:val="Heading4"/>
@@ -6152,8 +7012,8 @@
         <w:t xml:space="preserve">Best semantic quality, but needs internet + costs money</w:t>
       </w:r>
     </w:p>
-    <w:bookmarkEnd w:id="55"/>
-    <w:bookmarkStart w:id="56" w:name="auto-select"/>
+    <w:bookmarkEnd w:id="60"/>
+    <w:bookmarkStart w:id="61" w:name="auto-select"/>
     <w:p>
       <w:pPr>
         <w:pStyle w:val="Heading4"/>
@@ -6290,8 +7150,8 @@
         <w:t xml:space="preserve"># checks USE_OLLAMA</w:t>
       </w:r>
     </w:p>
-    <w:bookmarkEnd w:id="56"/>
-    <w:bookmarkStart w:id="57" w:name="ollama_chat-helper"/>
+    <w:bookmarkEnd w:id="61"/>
+    <w:bookmarkStart w:id="62" w:name="ollama_chat-helper"/>
     <w:p>
       <w:pPr>
         <w:pStyle w:val="Heading4"/>
@@ -6473,9 +7333,9 @@
         </w:pict>
       </w:r>
     </w:p>
-    <w:bookmarkEnd w:id="57"/>
-    <w:bookmarkEnd w:id="58"/>
-    <w:bookmarkStart w:id="62" w:name="mcp-protocol"/>
+    <w:bookmarkEnd w:id="62"/>
+    <w:bookmarkEnd w:id="63"/>
+    <w:bookmarkStart w:id="67" w:name="mcp-protocol"/>
     <w:p>
       <w:pPr>
         <w:pStyle w:val="Heading3"/>
@@ -6523,7 +7383,7 @@
         <w:t xml:space="preserve">= Model Context Protocol (Agent → Tools &amp; Data). Exposes an agent’s memory as callable tools and readable resources.</w:t>
       </w:r>
     </w:p>
-    <w:bookmarkStart w:id="59" w:name="build-an-mcp-server"/>
+    <w:bookmarkStart w:id="64" w:name="build-an-mcp-server"/>
     <w:p>
       <w:pPr>
         <w:pStyle w:val="Heading4"/>
@@ -6822,8 +7682,8 @@
         <w:t xml:space="preserve">— most recent memories</w:t>
       </w:r>
     </w:p>
-    <w:bookmarkEnd w:id="59"/>
-    <w:bookmarkStart w:id="60" w:name="mcp-client"/>
+    <w:bookmarkEnd w:id="64"/>
+    <w:bookmarkStart w:id="65" w:name="mcp-client"/>
     <w:p>
       <w:pPr>
         <w:pStyle w:val="Heading4"/>
@@ -7056,8 +7916,8 @@
         <w:t xml:space="preserve">(stats)</w:t>
       </w:r>
     </w:p>
-    <w:bookmarkEnd w:id="60"/>
-    <w:bookmarkStart w:id="61" w:name="mcptool-mcpresource"/>
+    <w:bookmarkEnd w:id="65"/>
+    <w:bookmarkStart w:id="66" w:name="mcptool-mcpresource"/>
     <w:p>
       <w:pPr>
         <w:pStyle w:val="Heading4"/>
@@ -7650,9 +8510,9 @@
         </w:pict>
       </w:r>
     </w:p>
-    <w:bookmarkEnd w:id="61"/>
-    <w:bookmarkEnd w:id="62"/>
-    <w:bookmarkStart w:id="69" w:name="a2a-protocol"/>
+    <w:bookmarkEnd w:id="66"/>
+    <w:bookmarkEnd w:id="67"/>
+    <w:bookmarkStart w:id="74" w:name="a2a-protocol"/>
     <w:p>
       <w:pPr>
         <w:pStyle w:val="Heading3"/>
@@ -7716,7 +8576,7 @@
         <w:t xml:space="preserve">(topics), share memories, and the bus routes them to peers whose interests match.</w:t>
       </w:r>
     </w:p>
-    <w:bookmarkStart w:id="63" w:name="agent-card"/>
+    <w:bookmarkStart w:id="68" w:name="agent-card"/>
     <w:p>
       <w:pPr>
         <w:pStyle w:val="Heading4"/>
@@ -8018,8 +8878,8 @@
         <w:t xml:space="preserve">card)</w:t>
       </w:r>
     </w:p>
-    <w:bookmarkEnd w:id="63"/>
-    <w:bookmarkStart w:id="64" w:name="a2a-bus"/>
+    <w:bookmarkEnd w:id="68"/>
+    <w:bookmarkStart w:id="69" w:name="a2a-bus"/>
     <w:p>
       <w:pPr>
         <w:pStyle w:val="Heading4"/>
@@ -8120,8 +8980,8 @@
         <w:t xml:space="preserve">bus.register(agent)</w:t>
       </w:r>
     </w:p>
-    <w:bookmarkEnd w:id="64"/>
-    <w:bookmarkStart w:id="65" w:name="share-memory"/>
+    <w:bookmarkEnd w:id="69"/>
+    <w:bookmarkStart w:id="70" w:name="share-memory"/>
     <w:p>
       <w:pPr>
         <w:pStyle w:val="Heading4"/>
@@ -8472,8 +9332,8 @@
         <w:t xml:space="preserve">recipient REMEMBERS memory_node</w:t>
       </w:r>
     </w:p>
-    <w:bookmarkEnd w:id="65"/>
-    <w:bookmarkStart w:id="66" w:name="preview-interest"/>
+    <w:bookmarkEnd w:id="70"/>
+    <w:bookmarkStart w:id="71" w:name="preview-interest"/>
     <w:p>
       <w:pPr>
         <w:pStyle w:val="Heading4"/>
@@ -8589,8 +9449,8 @@
         <w:t xml:space="preserve"># [{"agent_id": "...", "reason": "...", "score": ...}, ...]</w:t>
       </w:r>
     </w:p>
-    <w:bookmarkEnd w:id="66"/>
-    <w:bookmarkStart w:id="67" w:name="direct-send"/>
+    <w:bookmarkEnd w:id="71"/>
+    <w:bookmarkStart w:id="72" w:name="direct-send"/>
     <w:p>
       <w:pPr>
         <w:pStyle w:val="Heading4"/>
@@ -8772,8 +9632,8 @@
         <w:t xml:space="preserve"># adds to inbox</w:t>
       </w:r>
     </w:p>
-    <w:bookmarkEnd w:id="67"/>
-    <w:bookmarkStart w:id="68" w:name="inbox"/>
+    <w:bookmarkEnd w:id="72"/>
+    <w:bookmarkStart w:id="73" w:name="inbox"/>
     <w:p>
       <w:pPr>
         <w:pStyle w:val="Heading4"/>
@@ -8818,9 +9678,9 @@
         </w:pict>
       </w:r>
     </w:p>
-    <w:bookmarkEnd w:id="68"/>
-    <w:bookmarkEnd w:id="69"/>
-    <w:bookmarkStart w:id="75" w:name="orchestrator"/>
+    <w:bookmarkEnd w:id="73"/>
+    <w:bookmarkEnd w:id="74"/>
+    <w:bookmarkStart w:id="80" w:name="orchestrator"/>
     <w:p>
       <w:pPr>
         <w:pStyle w:val="Heading3"/>
@@ -8874,7 +9734,7 @@
         <w:t xml:space="preserve">graph store + embedder. Manages multiple agents, their MCP servers, and the A2A bus.</w:t>
       </w:r>
     </w:p>
-    <w:bookmarkStart w:id="70" w:name="constructor-2"/>
+    <w:bookmarkStart w:id="75" w:name="constructor-2"/>
     <w:p>
       <w:pPr>
         <w:pStyle w:val="Heading4"/>
@@ -9008,8 +9868,8 @@
         <w:t xml:space="preserve">)</w:t>
       </w:r>
     </w:p>
-    <w:bookmarkEnd w:id="70"/>
-    <w:bookmarkStart w:id="71" w:name="create-agents"/>
+    <w:bookmarkEnd w:id="75"/>
+    <w:bookmarkStart w:id="76" w:name="create-agents"/>
     <w:p>
       <w:pPr>
         <w:pStyle w:val="Heading4"/>
@@ -9250,8 +10110,8 @@
         <w:t xml:space="preserve">- A2A registration</w:t>
       </w:r>
     </w:p>
-    <w:bookmarkEnd w:id="71"/>
-    <w:bookmarkStart w:id="72" w:name="list-agents"/>
+    <w:bookmarkEnd w:id="76"/>
+    <w:bookmarkStart w:id="77" w:name="list-agents"/>
     <w:p>
       <w:pPr>
         <w:pStyle w:val="Heading4"/>
@@ -9292,8 +10152,8 @@
         <w:t xml:space="preserve"># [{"agent_id": "...", "name": "...", "inbox": 0, "owned_memories": 5, "memory": {...}}, ...]</w:t>
       </w:r>
     </w:p>
-    <w:bookmarkEnd w:id="72"/>
-    <w:bookmarkStart w:id="73" w:name="mcp-operations"/>
+    <w:bookmarkEnd w:id="77"/>
+    <w:bookmarkStart w:id="78" w:name="mcp-operations"/>
     <w:p>
       <w:pPr>
         <w:pStyle w:val="Heading4"/>
@@ -9562,8 +10422,8 @@
         <w:t xml:space="preserve"> orch.call_log()</w:t>
       </w:r>
     </w:p>
-    <w:bookmarkEnd w:id="73"/>
-    <w:bookmarkStart w:id="74" w:name="a2a-operations"/>
+    <w:bookmarkEnd w:id="78"/>
+    <w:bookmarkStart w:id="79" w:name="a2a-operations"/>
     <w:p>
       <w:pPr>
         <w:pStyle w:val="Heading4"/>
@@ -9941,9 +10801,9 @@
         </w:pict>
       </w:r>
     </w:p>
-    <w:bookmarkEnd w:id="74"/>
-    <w:bookmarkEnd w:id="75"/>
-    <w:bookmarkStart w:id="83" w:name="contextmanager"/>
+    <w:bookmarkEnd w:id="79"/>
+    <w:bookmarkEnd w:id="80"/>
+    <w:bookmarkStart w:id="88" w:name="contextmanager"/>
     <w:p>
       <w:pPr>
         <w:pStyle w:val="Heading3"/>
@@ -9997,7 +10857,7 @@
         <w:t xml:space="preserve">(16k–256k) by budgeting the prompt, retrieving only relevant memories, and rolling old turns into the graph.</w:t>
       </w:r>
     </w:p>
-    <w:bookmarkStart w:id="76" w:name="problem"/>
+    <w:bookmarkStart w:id="81" w:name="problem"/>
     <w:p>
       <w:pPr>
         <w:pStyle w:val="Heading4"/>
@@ -10047,8 +10907,8 @@
         <w:t xml:space="preserve">or errors.</w:t>
       </w:r>
     </w:p>
-    <w:bookmarkEnd w:id="76"/>
-    <w:bookmarkStart w:id="77" w:name="solution"/>
+    <w:bookmarkEnd w:id="81"/>
+    <w:bookmarkStart w:id="82" w:name="solution"/>
     <w:p>
       <w:pPr>
         <w:pStyle w:val="Heading4"/>
@@ -10176,8 +11036,8 @@
         <w:t xml:space="preserve">, always.</w:t>
       </w:r>
     </w:p>
-    <w:bookmarkEnd w:id="77"/>
-    <w:bookmarkStart w:id="78" w:name="constructor-3"/>
+    <w:bookmarkEnd w:id="82"/>
+    <w:bookmarkStart w:id="83" w:name="constructor-3"/>
     <w:p>
       <w:pPr>
         <w:pStyle w:val="Heading4"/>
@@ -10554,8 +11414,8 @@
         <w:t xml:space="preserve">)</w:t>
       </w:r>
     </w:p>
-    <w:bookmarkEnd w:id="78"/>
-    <w:bookmarkStart w:id="79" w:name="usage-loop"/>
+    <w:bookmarkEnd w:id="83"/>
+    <w:bookmarkStart w:id="84" w:name="usage-loop"/>
     <w:p>
       <w:pPr>
         <w:pStyle w:val="Heading4"/>
@@ -11196,8 +12056,8 @@
         <w:t xml:space="preserve">: reply})</w:t>
       </w:r>
     </w:p>
-    <w:bookmarkEnd w:id="79"/>
-    <w:bookmarkStart w:id="80" w:name="breakdown"/>
+    <w:bookmarkEnd w:id="84"/>
+    <w:bookmarkStart w:id="85" w:name="breakdown"/>
     <w:p>
       <w:pPr>
         <w:pStyle w:val="Heading4"/>
@@ -11289,8 +12149,8 @@
         <w:t xml:space="preserve"># }</w:t>
       </w:r>
     </w:p>
-    <w:bookmarkEnd w:id="80"/>
-    <w:bookmarkStart w:id="81" w:name="custom-token-counter"/>
+    <w:bookmarkEnd w:id="85"/>
+    <w:bookmarkStart w:id="86" w:name="custom-token-counter"/>
     <w:p>
       <w:pPr>
         <w:pStyle w:val="Heading4"/>
@@ -11463,8 +12323,8 @@
         <w:t xml:space="preserve">)</w:t>
       </w:r>
     </w:p>
-    <w:bookmarkEnd w:id="81"/>
-    <w:bookmarkStart w:id="82" w:name="custom-summarizer"/>
+    <w:bookmarkEnd w:id="86"/>
+    <w:bookmarkStart w:id="87" w:name="custom-summarizer"/>
     <w:p>
       <w:pPr>
         <w:pStyle w:val="Heading4"/>
@@ -11728,10 +12588,10 @@
         </w:pict>
       </w:r>
     </w:p>
-    <w:bookmarkEnd w:id="82"/>
-    <w:bookmarkEnd w:id="83"/>
-    <w:bookmarkEnd w:id="84"/>
-    <w:bookmarkStart w:id="90" w:name="usage-patterns"/>
+    <w:bookmarkEnd w:id="87"/>
+    <w:bookmarkEnd w:id="88"/>
+    <w:bookmarkEnd w:id="89"/>
+    <w:bookmarkStart w:id="95" w:name="usage-patterns"/>
     <w:p>
       <w:pPr>
         <w:pStyle w:val="Heading2"/>
@@ -11740,7 +12600,7 @@
         <w:t xml:space="preserve">Usage Patterns</w:t>
       </w:r>
     </w:p>
-    <w:bookmarkStart w:id="85" w:name="pattern-1-single-agent-long-term-memory"/>
+    <w:bookmarkStart w:id="90" w:name="pattern-1-single-agent-long-term-memory"/>
     <w:p>
       <w:pPr>
         <w:pStyle w:val="Heading3"/>
@@ -12081,8 +12941,8 @@
         <w:t xml:space="preserve">(context)</w:t>
       </w:r>
     </w:p>
-    <w:bookmarkEnd w:id="85"/>
-    <w:bookmarkStart w:id="86" w:name="X7a0a6599df2ce1582b85b73fc0ebfc883cf7540"/>
+    <w:bookmarkEnd w:id="90"/>
+    <w:bookmarkStart w:id="91" w:name="X7a0a6599df2ce1582b85b73fc0ebfc883cf7540"/>
     <w:p>
       <w:pPr>
         <w:pStyle w:val="Heading3"/>
@@ -12651,8 +13511,8 @@
         <w:t xml:space="preserve">)</w:t>
       </w:r>
     </w:p>
-    <w:bookmarkEnd w:id="86"/>
-    <w:bookmarkStart w:id="87" w:name="pattern-3-budget-safe-ollama-chat"/>
+    <w:bookmarkEnd w:id="91"/>
+    <w:bookmarkStart w:id="92" w:name="pattern-3-budget-safe-ollama-chat"/>
     <w:p>
       <w:pPr>
         <w:pStyle w:val="Heading3"/>
@@ -13155,8 +14015,8 @@
         <w:t xml:space="preserve">    ])</w:t>
       </w:r>
     </w:p>
-    <w:bookmarkEnd w:id="87"/>
-    <w:bookmarkStart w:id="88" w:name="pattern-4-project-knowledge-base"/>
+    <w:bookmarkEnd w:id="92"/>
+    <w:bookmarkStart w:id="93" w:name="pattern-4-project-knowledge-base"/>
     <w:p>
       <w:pPr>
         <w:pStyle w:val="Heading3"/>
@@ -13488,8 +14348,8 @@
         <w:t xml:space="preserve">])</w:t>
       </w:r>
     </w:p>
-    <w:bookmarkEnd w:id="88"/>
-    <w:bookmarkStart w:id="89" w:name="pattern-5-session-scoped-memories"/>
+    <w:bookmarkEnd w:id="93"/>
+    <w:bookmarkStart w:id="94" w:name="pattern-5-session-scoped-memories"/>
     <w:p>
       <w:pPr>
         <w:pStyle w:val="Heading3"/>
@@ -13687,9 +14547,9 @@
         </w:pict>
       </w:r>
     </w:p>
-    <w:bookmarkEnd w:id="89"/>
-    <w:bookmarkEnd w:id="90"/>
-    <w:bookmarkStart w:id="91" w:name="examples"/>
+    <w:bookmarkEnd w:id="94"/>
+    <w:bookmarkEnd w:id="95"/>
+    <w:bookmarkStart w:id="96" w:name="examples"/>
     <w:p>
       <w:pPr>
         <w:pStyle w:val="Heading2"/>
@@ -13979,8 +14839,8 @@
         </w:pict>
       </w:r>
     </w:p>
-    <w:bookmarkEnd w:id="91"/>
-    <w:bookmarkStart w:id="100" w:name="best-practices"/>
+    <w:bookmarkEnd w:id="96"/>
+    <w:bookmarkStart w:id="105" w:name="best-practices"/>
     <w:p>
       <w:pPr>
         <w:pStyle w:val="Heading2"/>
@@ -13989,7 +14849,7 @@
         <w:t xml:space="preserve">Best Practices</w:t>
       </w:r>
     </w:p>
-    <w:bookmarkStart w:id="92" w:name="choose-the-right-embedder"/>
+    <w:bookmarkStart w:id="97" w:name="choose-the-right-embedder"/>
     <w:p>
       <w:pPr>
         <w:pStyle w:val="Heading3"/>
@@ -14174,8 +15034,8 @@
         </w:tc>
       </w:tr>
     </w:tbl>
-    <w:bookmarkEnd w:id="92"/>
-    <w:bookmarkStart w:id="93" w:name="use-memory-types-intentionally"/>
+    <w:bookmarkEnd w:id="97"/>
+    <w:bookmarkStart w:id="98" w:name="use-memory-types-intentionally"/>
     <w:p>
       <w:pPr>
         <w:pStyle w:val="Heading3"/>
@@ -14289,8 +15149,8 @@
         <w:t xml:space="preserve">— for affective state (optional)</w:t>
       </w:r>
     </w:p>
-    <w:bookmarkEnd w:id="93"/>
-    <w:bookmarkStart w:id="94" w:name="persist-regularly"/>
+    <w:bookmarkEnd w:id="98"/>
+    <w:bookmarkStart w:id="99" w:name="persist-regularly"/>
     <w:p>
       <w:pPr>
         <w:pStyle w:val="Heading3"/>
@@ -14391,8 +15251,8 @@
         <w:t xml:space="preserve">store.save()</w:t>
       </w:r>
     </w:p>
-    <w:bookmarkEnd w:id="94"/>
-    <w:bookmarkStart w:id="95" w:name="label-scope-your-searches"/>
+    <w:bookmarkEnd w:id="99"/>
+    <w:bookmarkStart w:id="100" w:name="label-scope-your-searches"/>
     <w:p>
       <w:pPr>
         <w:pStyle w:val="Heading3"/>
@@ -14519,8 +15379,8 @@
         <w:t xml:space="preserve">)</w:t>
       </w:r>
     </w:p>
-    <w:bookmarkEnd w:id="95"/>
-    <w:bookmarkStart w:id="96" w:name="X7fa18bc9018e24cca7f270a54df08adaba509f7"/>
+    <w:bookmarkEnd w:id="100"/>
+    <w:bookmarkStart w:id="101" w:name="X7fa18bc9018e24cca7f270a54df08adaba509f7"/>
     <w:p>
       <w:pPr>
         <w:pStyle w:val="Heading3"/>
@@ -14671,8 +15531,8 @@
         </w:tc>
       </w:tr>
     </w:tbl>
-    <w:bookmarkEnd w:id="96"/>
-    <w:bookmarkStart w:id="97" w:name="use-reflect-periodically"/>
+    <w:bookmarkEnd w:id="101"/>
+    <w:bookmarkStart w:id="102" w:name="use-reflect-periodically"/>
     <w:p>
       <w:pPr>
         <w:pStyle w:val="Heading3"/>
@@ -14768,8 +15628,8 @@
         <w:t xml:space="preserve">This keeps high-level context available for retrieval.</w:t>
       </w:r>
     </w:p>
-    <w:bookmarkEnd w:id="97"/>
-    <w:bookmarkStart w:id="98" w:name="monitor-duplicate-detections"/>
+    <w:bookmarkEnd w:id="102"/>
+    <w:bookmarkStart w:id="103" w:name="monitor-duplicate-detections"/>
     <w:p>
       <w:pPr>
         <w:pStyle w:val="Heading3"/>
@@ -14861,8 +15721,8 @@
         <w:t xml:space="preserve">)</w:t>
       </w:r>
     </w:p>
-    <w:bookmarkEnd w:id="98"/>
-    <w:bookmarkStart w:id="99" w:name="delete-stale-sessions"/>
+    <w:bookmarkEnd w:id="103"/>
+    <w:bookmarkStart w:id="104" w:name="delete-stale-sessions"/>
     <w:p>
       <w:pPr>
         <w:pStyle w:val="Heading3"/>
@@ -15021,9 +15881,9 @@
         </w:pict>
       </w:r>
     </w:p>
-    <w:bookmarkEnd w:id="99"/>
-    <w:bookmarkEnd w:id="100"/>
-    <w:bookmarkStart w:id="108" w:name="troubleshooting"/>
+    <w:bookmarkEnd w:id="104"/>
+    <w:bookmarkEnd w:id="105"/>
+    <w:bookmarkStart w:id="113" w:name="troubleshooting"/>
     <w:p>
       <w:pPr>
         <w:pStyle w:val="Heading2"/>
@@ -15032,7 +15892,7 @@
         <w:t xml:space="preserve">Troubleshooting</w:t>
       </w:r>
     </w:p>
-    <w:bookmarkStart w:id="101" w:name="X32d2bf3d1cc29896fa0826412fa7f48eaaf04c2"/>
+    <w:bookmarkStart w:id="106" w:name="X32d2bf3d1cc29896fa0826412fa7f48eaaf04c2"/>
     <w:p>
       <w:pPr>
         <w:pStyle w:val="Heading3"/>
@@ -15121,8 +15981,8 @@
         <w:t xml:space="preserve"> pull nomic-embed-text</w:t>
       </w:r>
     </w:p>
-    <w:bookmarkEnd w:id="101"/>
-    <w:bookmarkStart w:id="102" w:name="grapherror-dimensionmismatch"/>
+    <w:bookmarkEnd w:id="106"/>
+    <w:bookmarkStart w:id="107" w:name="grapherror-dimensionmismatch"/>
     <w:p>
       <w:pPr>
         <w:pStyle w:val="Heading3"/>
@@ -15173,8 +16033,8 @@
         <w:t xml:space="preserve">Use the same embedder consistently, or clear the graph and rebuild.</w:t>
       </w:r>
     </w:p>
-    <w:bookmarkEnd w:id="102"/>
-    <w:bookmarkStart w:id="103" w:name="Xeaeca83ee5e084d6f543f7d6bae19717d6c8c12"/>
+    <w:bookmarkEnd w:id="107"/>
+    <w:bookmarkStart w:id="108" w:name="Xeaeca83ee5e084d6f543f7d6bae19717d6c8c12"/>
     <w:p>
       <w:pPr>
         <w:pStyle w:val="Heading3"/>
@@ -15312,8 +16172,8 @@
         <w:t xml:space="preserve">by 10–20% as a safety margin</w:t>
       </w:r>
     </w:p>
-    <w:bookmarkEnd w:id="103"/>
-    <w:bookmarkStart w:id="104" w:name="a2a-routing-doesnt-deliver-messages"/>
+    <w:bookmarkEnd w:id="108"/>
+    <w:bookmarkStart w:id="109" w:name="a2a-routing-doesnt-deliver-messages"/>
     <w:p>
       <w:pPr>
         <w:pStyle w:val="Heading3"/>
@@ -15418,8 +16278,8 @@
         <w:t xml:space="preserve">)</w:t>
       </w:r>
     </w:p>
-    <w:bookmarkEnd w:id="104"/>
-    <w:bookmarkStart w:id="105" w:name="graph-file-corrupted-after-crash"/>
+    <w:bookmarkEnd w:id="109"/>
+    <w:bookmarkStart w:id="110" w:name="graph-file-corrupted-after-crash"/>
     <w:p>
       <w:pPr>
         <w:pStyle w:val="Heading3"/>
@@ -15476,8 +16336,8 @@
         <w:t xml:space="preserve">→ rename), so corruption is rare. The Python backend doesn’t — use the Rust backend for production, or implement your own backup strategy.</w:t>
       </w:r>
     </w:p>
-    <w:bookmarkEnd w:id="105"/>
-    <w:bookmarkStart w:id="106" w:name="memory-search-returns-irrelevant-results"/>
+    <w:bookmarkEnd w:id="110"/>
+    <w:bookmarkStart w:id="111" w:name="memory-search-returns-irrelevant-results"/>
     <w:p>
       <w:pPr>
         <w:pStyle w:val="Heading3"/>
@@ -15605,8 +16465,8 @@
         <w:t xml:space="preserve">OllamaEmbedder())</w:t>
       </w:r>
     </w:p>
-    <w:bookmarkEnd w:id="106"/>
-    <w:bookmarkStart w:id="107" w:name="webui-shows-0-agents-after-restart"/>
+    <w:bookmarkEnd w:id="111"/>
+    <w:bookmarkStart w:id="112" w:name="webui-shows-0-agents-after-restart"/>
     <w:p>
       <w:pPr>
         <w:pStyle w:val="Heading3"/>
@@ -15718,9 +16578,9 @@
         </w:pict>
       </w:r>
     </w:p>
-    <w:bookmarkEnd w:id="107"/>
-    <w:bookmarkEnd w:id="108"/>
-    <w:bookmarkStart w:id="121" w:name="training-dataset-pipeline"/>
+    <w:bookmarkEnd w:id="112"/>
+    <w:bookmarkEnd w:id="113"/>
+    <w:bookmarkStart w:id="126" w:name="training-dataset-pipeline"/>
     <w:p>
       <w:pPr>
         <w:pStyle w:val="Heading2"/>
@@ -15768,7 +16628,7 @@
         <w:t xml:space="preserve">pipeline that turns local files into fine-tuning datasets for any LLM.</w:t>
       </w:r>
     </w:p>
-    <w:bookmarkStart w:id="109" w:name="pipeline-overview"/>
+    <w:bookmarkStart w:id="114" w:name="pipeline-overview"/>
     <w:p>
       <w:pPr>
         <w:pStyle w:val="Heading3"/>
@@ -15896,8 +16756,8 @@
         <w:t xml:space="preserve">   JSONL / CSV / Parquet file</w:t>
       </w:r>
     </w:p>
-    <w:bookmarkEnd w:id="109"/>
-    <w:bookmarkStart w:id="110" w:name="quick-start-1"/>
+    <w:bookmarkEnd w:id="114"/>
+    <w:bookmarkStart w:id="115" w:name="quick-start-1"/>
     <w:p>
       <w:pPr>
         <w:pStyle w:val="Heading3"/>
@@ -16362,8 +17222,8 @@
         </w:pict>
       </w:r>
     </w:p>
-    <w:bookmarkEnd w:id="110"/>
-    <w:bookmarkStart w:id="111" w:name="documentloader"/>
+    <w:bookmarkEnd w:id="115"/>
+    <w:bookmarkStart w:id="116" w:name="documentloader"/>
     <w:p>
       <w:pPr>
         <w:pStyle w:val="Heading3"/>
@@ -17217,8 +18077,8 @@
         </w:pict>
       </w:r>
     </w:p>
-    <w:bookmarkEnd w:id="111"/>
-    <w:bookmarkStart w:id="112" w:name="datasetbuilder"/>
+    <w:bookmarkEnd w:id="116"/>
+    <w:bookmarkStart w:id="117" w:name="datasetbuilder"/>
     <w:p>
       <w:pPr>
         <w:pStyle w:val="Heading3"/>
@@ -18304,8 +19164,8 @@
         </w:pict>
       </w:r>
     </w:p>
-    <w:bookmarkEnd w:id="112"/>
-    <w:bookmarkStart w:id="118" w:name="output-formats"/>
+    <w:bookmarkEnd w:id="117"/>
+    <w:bookmarkStart w:id="123" w:name="output-formats"/>
     <w:p>
       <w:pPr>
         <w:pStyle w:val="Heading3"/>
@@ -18322,7 +19182,7 @@
         <w:t xml:space="preserve">Five training-data formats are supported:</w:t>
       </w:r>
     </w:p>
-    <w:bookmarkStart w:id="113" w:name="raw-plain-chunk-text"/>
+    <w:bookmarkStart w:id="118" w:name="raw-plain-chunk-text"/>
     <w:p>
       <w:pPr>
         <w:pStyle w:val="Heading4"/>
@@ -18588,8 +19448,8 @@
         <w:t xml:space="preserve">}</w:t>
       </w:r>
     </w:p>
-    <w:bookmarkEnd w:id="113"/>
-    <w:bookmarkStart w:id="114" w:name="Xfb4d8d2465cfe45a72eaadf8dff1c65515f85f8"/>
+    <w:bookmarkEnd w:id="118"/>
+    <w:bookmarkStart w:id="119" w:name="Xfb4d8d2465cfe45a72eaadf8dff1c65515f85f8"/>
     <w:p>
       <w:pPr>
         <w:pStyle w:val="Heading4"/>
@@ -18711,8 +19571,8 @@
         <w:t xml:space="preserve">}</w:t>
       </w:r>
     </w:p>
-    <w:bookmarkEnd w:id="114"/>
-    <w:bookmarkStart w:id="115" w:name="qa-question-answer-context-triple"/>
+    <w:bookmarkEnd w:id="119"/>
+    <w:bookmarkStart w:id="120" w:name="qa-question-answer-context-triple"/>
     <w:p>
       <w:pPr>
         <w:pStyle w:val="Heading4"/>
@@ -18978,8 +19838,8 @@
         <w:t xml:space="preserve">}</w:t>
       </w:r>
     </w:p>
-    <w:bookmarkEnd w:id="115"/>
-    <w:bookmarkStart w:id="116" w:name="alpaca-alpaca-llama-instruction-format"/>
+    <w:bookmarkEnd w:id="120"/>
+    <w:bookmarkStart w:id="121" w:name="alpaca-alpaca-llama-instruction-format"/>
     <w:p>
       <w:pPr>
         <w:pStyle w:val="Heading4"/>
@@ -19128,8 +19988,8 @@
         <w:t xml:space="preserve">}</w:t>
       </w:r>
     </w:p>
-    <w:bookmarkEnd w:id="116"/>
-    <w:bookmarkStart w:id="117" w:name="openai-openai-chat-fine-tuning-format"/>
+    <w:bookmarkEnd w:id="121"/>
+    <w:bookmarkStart w:id="122" w:name="openai-openai-chat-fine-tuning-format"/>
     <w:p>
       <w:pPr>
         <w:pStyle w:val="Heading4"/>
@@ -19477,9 +20337,9 @@
         </w:pict>
       </w:r>
     </w:p>
-    <w:bookmarkEnd w:id="117"/>
-    <w:bookmarkEnd w:id="118"/>
-    <w:bookmarkStart w:id="119" w:name="ollama-qa-generator"/>
+    <w:bookmarkEnd w:id="122"/>
+    <w:bookmarkEnd w:id="123"/>
+    <w:bookmarkStart w:id="124" w:name="ollama-qa-generator"/>
     <w:p>
       <w:pPr>
         <w:pStyle w:val="Heading3"/>
@@ -19903,8 +20763,8 @@
         </w:pict>
       </w:r>
     </w:p>
-    <w:bookmarkEnd w:id="119"/>
-    <w:bookmarkStart w:id="120" w:name="export"/>
+    <w:bookmarkEnd w:id="124"/>
+    <w:bookmarkStart w:id="125" w:name="export"/>
     <w:p>
       <w:pPr>
         <w:pStyle w:val="Heading3"/>
@@ -20569,9 +21429,9 @@
         </w:pict>
       </w:r>
     </w:p>
-    <w:bookmarkEnd w:id="120"/>
-    <w:bookmarkEnd w:id="121"/>
-    <w:bookmarkStart w:id="130" w:name="needle2-integration"/>
+    <w:bookmarkEnd w:id="125"/>
+    <w:bookmarkEnd w:id="126"/>
+    <w:bookmarkStart w:id="135" w:name="needle2-integration"/>
     <w:p>
       <w:pPr>
         <w:pStyle w:val="Heading2"/>
@@ -20600,7 +21460,7 @@
       <w:r>
         <w:t xml:space="preserve"> </w:t>
       </w:r>
-      <w:hyperlink r:id="rId122">
+      <w:hyperlink r:id="rId127">
         <w:r>
           <w:rPr>
             <w:rStyle w:val="VerbatimChar"/>
@@ -20853,7 +21713,7 @@
         <w:t xml:space="preserve">) requires it.</w:t>
       </w:r>
     </w:p>
-    <w:bookmarkStart w:id="123" w:name="installation-1"/>
+    <w:bookmarkStart w:id="128" w:name="installation-1"/>
     <w:p>
       <w:pPr>
         <w:pStyle w:val="Heading3"/>
@@ -20984,8 +21844,8 @@
         <w:t xml:space="preserve"># Apple Silicon</w:t>
       </w:r>
     </w:p>
-    <w:bookmarkEnd w:id="123"/>
-    <w:bookmarkStart w:id="124" w:name="grouped-knowledge-bases"/>
+    <w:bookmarkEnd w:id="128"/>
+    <w:bookmarkStart w:id="129" w:name="grouped-knowledge-bases"/>
     <w:p>
       <w:pPr>
         <w:pStyle w:val="Heading3"/>
@@ -21120,8 +21980,8 @@
         </w:pict>
       </w:r>
     </w:p>
-    <w:bookmarkEnd w:id="124"/>
-    <w:bookmarkStart w:id="125" w:name="needleagentgroup"/>
+    <w:bookmarkEnd w:id="129"/>
+    <w:bookmarkStart w:id="130" w:name="needleagentgroup"/>
     <w:p>
       <w:pPr>
         <w:pStyle w:val="Heading3"/>
@@ -21697,8 +22557,8 @@
         </w:pict>
       </w:r>
     </w:p>
-    <w:bookmarkEnd w:id="125"/>
-    <w:bookmarkStart w:id="126" w:name="training-workflow"/>
+    <w:bookmarkEnd w:id="130"/>
+    <w:bookmarkStart w:id="131" w:name="training-workflow"/>
     <w:p>
       <w:pPr>
         <w:pStyle w:val="Heading3"/>
@@ -22071,8 +22931,8 @@
         </w:pict>
       </w:r>
     </w:p>
-    <w:bookmarkEnd w:id="126"/>
-    <w:bookmarkStart w:id="127" w:name="needleorchestrator"/>
+    <w:bookmarkEnd w:id="131"/>
+    <w:bookmarkStart w:id="132" w:name="needleorchestrator"/>
     <w:p>
       <w:pPr>
         <w:pStyle w:val="Heading3"/>
@@ -22524,8 +23384,8 @@
         </w:pict>
       </w:r>
     </w:p>
-    <w:bookmarkEnd w:id="127"/>
-    <w:bookmarkStart w:id="128" w:name="build_needle_dataset"/>
+    <w:bookmarkEnd w:id="132"/>
+    <w:bookmarkStart w:id="133" w:name="build_needle_dataset"/>
     <w:p>
       <w:pPr>
         <w:pStyle w:val="Heading3"/>
@@ -23523,8 +24383,8 @@
         </w:pict>
       </w:r>
     </w:p>
-    <w:bookmarkEnd w:id="128"/>
-    <w:bookmarkStart w:id="129" w:name="graphdb_tool_schemas"/>
+    <w:bookmarkEnd w:id="133"/>
+    <w:bookmarkStart w:id="134" w:name="graphdb_tool_schemas"/>
     <w:p>
       <w:pPr>
         <w:pStyle w:val="Heading3"/>
@@ -23803,9 +24663,9 @@
         </w:pict>
       </w:r>
     </w:p>
-    <w:bookmarkEnd w:id="129"/>
-    <w:bookmarkEnd w:id="130"/>
-    <w:bookmarkStart w:id="131" w:name="summary"/>
+    <w:bookmarkEnd w:id="134"/>
+    <w:bookmarkEnd w:id="135"/>
+    <w:bookmarkStart w:id="136" w:name="summary"/>
     <w:p>
       <w:pPr>
         <w:pStyle w:val="Heading2"/>
@@ -24353,8 +25213,8 @@
         <w:t xml:space="preserve">Happy building! 🚀</w:t>
       </w:r>
     </w:p>
-    <w:bookmarkEnd w:id="131"/>
-    <w:bookmarkEnd w:id="132"/>
+    <w:bookmarkEnd w:id="136"/>
+    <w:bookmarkEnd w:id="137"/>
     <w:sectPr/>
   </w:body>
 </w:document>

</xml_diff>